<commit_message>
Re-procesování VŠECH dokumentů s aktuálním blacklistem
Provedeno:
- Zpracováno všech 7 dokumentů (smlouva.docx + smlouva0-6.docx)
- Všechny mapy mají aktuální timestamp (Oct 29 08:55-08:56)
- Přidán chybějící smlouva_map.json do repozitáře

Ověření:
✅ smlouva.docx: 3 osoby (Jan Novák, Petra Svobodová, Kateřina Svobodová)
✅ smlouva0.docx: 18 osob
✅ smlouva2.docx: 2 osoby (Tomáš Konečný, Lucie Doležalová) - OPRAVENO z 3 osob!
✅ smlouva3.docx: 2 osoby
✅ smlouva4.docx: 6 osob
✅ smlouva5.docx: 10 osob
✅ smlouva6.docx: 4 osob

Audit: 🎉 Všechny mapy čisté, žádná běžná slova v PERSON tazích.

🤖 Generated with [Claude Code](https://claude.com/claude-code)

Co-Authored-By: Claude <noreply@anthropic.com>
</commit_message>
<xml_diff>
--- a/smlouva_anon.docx
+++ b/smlouva_anon.docx
@@ -192,7 +192,7 @@
     <w:p/>
     <w:p>
       <w:r>
-        <w:t>Vozidlo je prodáváno [[ADDRESS_3]]. 4. 2026.</w:t>
+        <w:t>Vozidlo je prodáváno včetně veškerého příslušenství, dokladů a platné technické kontroly do [[DATE_3]].</w:t>
       </w:r>
     </w:p>
     <w:p/>
@@ -417,7 +417,7 @@
     <w:p/>
     <w:p>
       <w:r>
-        <w:t>V Přerově dne **[[DATE_3]]**</w:t>
+        <w:t>V Přerově dne **[[DATE_4]]**</w:t>
       </w:r>
     </w:p>
     <w:p/>

</xml_diff>